<commit_message>
Deploy WatchTok Survey V3 testing update
Separates test and production progress, updates the public email and follow-up wording, and adds the new research logo.
</commit_message>
<xml_diff>
--- a/docs/WatchTok_Survey_Technical_Handoff_V8.docx
+++ b/docs/WatchTok_Survey_Technical_Handoff_V8.docx
@@ -1203,7 +1203,7 @@
           <w:color w:val="111827"/>
           <w:sz w:val="22"/>
         </w:rPr>
-        <w:t>Test and production responses are separated by is_test.</w:t>
+        <w:t>Test and production responses are separated by is_test and by browser-storage scope.</w:t>
       </w:r>
     </w:p>
     <w:p>
@@ -1220,7 +1220,7 @@
           <w:color w:val="111827"/>
           <w:sz w:val="22"/>
         </w:rPr>
-        <w:t>Deletion requests route to bjelajac.cristopher@gmail.com.</w:t>
+        <w:t>Deletion requests route to watchtoksurvey@gmail.com.</w:t>
       </w:r>
     </w:p>
     <w:p>

</xml_diff>

<commit_message>
Deploy WatchTok Survey V4 testing fixes
Cleans question instructions, revises the section transition, limits contact consent to future surveys, and disables contact submission in Test Mode.
</commit_message>
<xml_diff>
--- a/docs/WatchTok_Survey_Technical_Handoff_V8.docx
+++ b/docs/WatchTok_Survey_Technical_Handoff_V8.docx
@@ -415,7 +415,24 @@
           <w:color w:val="111827"/>
           <w:sz w:val="22"/>
         </w:rPr>
-        <w:t>Optional follow-up email stored only after completion and separately from research answers.</w:t>
+        <w:t>Optional future-survey invitation email stored only after completion and separately from research answers.</w:t>
+      </w:r>
+    </w:p>
+    <w:p>
+      <w:pPr>
+        <w:pStyle w:val="ListBullet"/>
+        <w:spacing w:after="80" w:line="300" w:lineRule="auto"/>
+        <w:ind w:left="540" w:hanging="271"/>
+      </w:pPr>
+      <w:r>
+        <w:rPr>
+          <w:rFonts w:ascii="Calibri" w:hAnsi="Calibri"/>
+          <w:b w:val="0"/>
+          <w:i w:val="0"/>
+          <w:color w:val="111827"/>
+          <w:sz w:val="22"/>
+        </w:rPr>
+        <w:t>Test Mode cannot submit contact information.</w:t>
       </w:r>
     </w:p>
     <w:p>
@@ -644,6 +661,23 @@
           <w:sz w:val="22"/>
         </w:rPr>
         <w:t>Fields: id, email, receive_report, future_research, and consented_at.</w:t>
+      </w:r>
+    </w:p>
+    <w:p>
+      <w:pPr>
+        <w:pStyle w:val="ListBullet"/>
+        <w:spacing w:after="80" w:line="300" w:lineRule="auto"/>
+        <w:ind w:left="540" w:hanging="271"/>
+      </w:pPr>
+      <w:r>
+        <w:rPr>
+          <w:rFonts w:ascii="Calibri" w:hAnsi="Calibri"/>
+          <w:b w:val="0"/>
+          <w:i w:val="0"/>
+          <w:color w:val="111827"/>
+          <w:sz w:val="22"/>
+        </w:rPr>
+        <w:t>The V4 client writes future_research=true and receive_report=false; receive_report remains only for database compatibility.</w:t>
       </w:r>
     </w:p>
     <w:p>
@@ -1126,6 +1160,40 @@
           <w:color w:val="111827"/>
           <w:sz w:val="22"/>
         </w:rPr>
+        <w:t>Single clean instruction rendering and approved transition wording.</w:t>
+      </w:r>
+    </w:p>
+    <w:p>
+      <w:pPr>
+        <w:pStyle w:val="ListBullet"/>
+        <w:spacing w:after="80" w:line="300" w:lineRule="auto"/>
+        <w:ind w:left="540" w:hanging="271"/>
+      </w:pPr>
+      <w:r>
+        <w:rPr>
+          <w:rFonts w:ascii="Calibri" w:hAnsi="Calibri"/>
+          <w:b w:val="0"/>
+          <w:i w:val="0"/>
+          <w:color w:val="111827"/>
+          <w:sz w:val="22"/>
+        </w:rPr>
+        <w:t>Future-surveys-only consent and Test Mode contact-entry prevention.</w:t>
+      </w:r>
+    </w:p>
+    <w:p>
+      <w:pPr>
+        <w:pStyle w:val="ListBullet"/>
+        <w:spacing w:after="80" w:line="300" w:lineRule="auto"/>
+        <w:ind w:left="540" w:hanging="271"/>
+      </w:pPr>
+      <w:r>
+        <w:rPr>
+          <w:rFonts w:ascii="Calibri" w:hAnsi="Calibri"/>
+          <w:b w:val="0"/>
+          <w:i w:val="0"/>
+          <w:color w:val="111827"/>
+          <w:sz w:val="22"/>
+        </w:rPr>
         <w:t>Live anonymous sign-in, partial insert, owner-only read, and completed-status update.</w:t>
       </w:r>
     </w:p>
@@ -1169,7 +1237,7 @@
           <w:color w:val="111827"/>
           <w:sz w:val="22"/>
         </w:rPr>
-        <w:t>Optional email is never placed inside answers JSONB.</w:t>
+        <w:t>Optional email is used only for future survey invitations and is never placed inside answers JSONB.</w:t>
       </w:r>
     </w:p>
     <w:p>

</xml_diff>